<commit_message>
Se sube PRC2 y MODEXAMEN1
</commit_message>
<xml_diff>
--- a/DB2 SQL/AC12_Practica Corte de control - SQL COUNT - GROUP BY - ORDER BY/Heck_NicoleDenise_Claseasincronica12.pdf.docx
+++ b/DB2 SQL/AC12_Practica Corte de control - SQL COUNT - GROUP BY - ORDER BY/Heck_NicoleDenise_Claseasincronica12.pdf.docx
@@ -452,6 +452,7 @@
       </w:pPr>
       <w:r>
         <w:rPr>
+          <w:noProof/>
           <w:lang w:val="en-US"/>
         </w:rPr>
         <w:drawing>
@@ -497,8 +498,19 @@
           <w:lang w:val="en-US"/>
         </w:rPr>
       </w:pPr>
-      <w:r>
-        <w:t xml:space="preserve">ejecución </w:t>
+      <w:proofErr w:type="spellStart"/>
+      <w:r>
+        <w:rPr>
+          <w:lang w:val="en-US"/>
+        </w:rPr>
+        <w:t>ejecución</w:t>
+      </w:r>
+      <w:proofErr w:type="spellEnd"/>
+      <w:r>
+        <w:rPr>
+          <w:lang w:val="en-US"/>
+        </w:rPr>
+        <w:t xml:space="preserve"> </w:t>
       </w:r>
       <w:r>
         <w:rPr>
@@ -528,6 +540,7 @@
       </w:pPr>
       <w:r>
         <w:rPr>
+          <w:noProof/>
           <w:lang w:val="en-US"/>
         </w:rPr>
         <w:drawing>
@@ -575,6 +588,7 @@
       </w:pPr>
       <w:r>
         <w:rPr>
+          <w:noProof/>
           <w:lang w:val="en-US"/>
         </w:rPr>
         <w:drawing>
@@ -661,13 +675,7 @@
         <w:rPr>
           <w:lang w:val="en-US"/>
         </w:rPr>
-        <w:t>SDSF OUTPUT DISPLAY KC03C52J JOB05329</w:t>
-      </w:r>
-      <w:r>
-        <w:rPr>
-          <w:lang w:val="en-US"/>
-        </w:rPr>
-        <w:t xml:space="preserve"> </w:t>
+        <w:t xml:space="preserve">SDSF OUTPUT DISPLAY KC03C52J JOB05329 </w:t>
       </w:r>
     </w:p>
     <w:p>
@@ -919,6 +927,7 @@
         <w:rPr>
           <w:b/>
           <w:bCs/>
+          <w:noProof/>
           <w:lang w:val="en-US"/>
         </w:rPr>
         <w:drawing>
@@ -956,6 +965,1639 @@
             </a:graphic>
           </wp:inline>
         </w:drawing>
+      </w:r>
+    </w:p>
+    <w:p>
+      <w:pPr>
+        <w:rPr>
+          <w:b/>
+          <w:bCs/>
+          <w:lang w:val="en-US"/>
+        </w:rPr>
+      </w:pPr>
+      <w:r>
+        <w:rPr>
+          <w:b/>
+          <w:bCs/>
+          <w:lang w:val="en-US"/>
+        </w:rPr>
+        <w:t>** FIN RESULTADO ANTERIOR **</w:t>
+      </w:r>
+    </w:p>
+    <w:p>
+      <w:pPr>
+        <w:rPr>
+          <w:b/>
+          <w:bCs/>
+          <w:lang w:val="en-US"/>
+        </w:rPr>
+      </w:pPr>
+    </w:p>
+    <w:p>
+      <w:pPr>
+        <w:rPr>
+          <w:b/>
+          <w:bCs/>
+          <w:lang w:val="en-US"/>
+        </w:rPr>
+      </w:pPr>
+    </w:p>
+    <w:p>
+      <w:pPr>
+        <w:rPr>
+          <w:b/>
+          <w:bCs/>
+          <w:lang w:val="en-US"/>
+        </w:rPr>
+      </w:pPr>
+    </w:p>
+    <w:p>
+      <w:pPr>
+        <w:rPr>
+          <w:b/>
+          <w:bCs/>
+        </w:rPr>
+      </w:pPr>
+      <w:r>
+        <w:rPr>
+          <w:b/>
+          <w:bCs/>
+          <w:noProof/>
+          <w:lang w:val="en-US"/>
+        </w:rPr>
+        <w:lastRenderedPageBreak/>
+        <w:drawing>
+          <wp:anchor distT="0" distB="0" distL="114300" distR="114300" simplePos="0" relativeHeight="251657215" behindDoc="1" locked="0" layoutInCell="1" allowOverlap="1" wp14:anchorId="6D182897" wp14:editId="30B5A832">
+            <wp:simplePos x="0" y="0"/>
+            <wp:positionH relativeFrom="margin">
+              <wp:align>left</wp:align>
+            </wp:positionH>
+            <wp:positionV relativeFrom="paragraph">
+              <wp:posOffset>258792</wp:posOffset>
+            </wp:positionV>
+            <wp:extent cx="4885899" cy="3366568"/>
+            <wp:effectExtent l="0" t="0" r="0" b="5715"/>
+            <wp:wrapNone/>
+            <wp:docPr id="855406315" name="Picture 1"/>
+            <wp:cNvGraphicFramePr>
+              <a:graphicFrameLocks xmlns:a="http://schemas.openxmlformats.org/drawingml/2006/main" noChangeAspect="1"/>
+            </wp:cNvGraphicFramePr>
+            <a:graphic xmlns:a="http://schemas.openxmlformats.org/drawingml/2006/main">
+              <a:graphicData uri="http://schemas.openxmlformats.org/drawingml/2006/picture">
+                <pic:pic xmlns:pic="http://schemas.openxmlformats.org/drawingml/2006/picture">
+                  <pic:nvPicPr>
+                    <pic:cNvPr id="855406315" name=""/>
+                    <pic:cNvPicPr/>
+                  </pic:nvPicPr>
+                  <pic:blipFill>
+                    <a:blip r:embed="rId11">
+                      <a:extLst>
+                        <a:ext uri="{28A0092B-C50C-407E-A947-70E740481C1C}">
+                          <a14:useLocalDpi xmlns:a14="http://schemas.microsoft.com/office/drawing/2010/main" val="0"/>
+                        </a:ext>
+                      </a:extLst>
+                    </a:blip>
+                    <a:stretch>
+                      <a:fillRect/>
+                    </a:stretch>
+                  </pic:blipFill>
+                  <pic:spPr>
+                    <a:xfrm>
+                      <a:off x="0" y="0"/>
+                      <a:ext cx="4885899" cy="3366568"/>
+                    </a:xfrm>
+                    <a:prstGeom prst="rect">
+                      <a:avLst/>
+                    </a:prstGeom>
+                  </pic:spPr>
+                </pic:pic>
+              </a:graphicData>
+            </a:graphic>
+            <wp14:sizeRelH relativeFrom="page">
+              <wp14:pctWidth>0</wp14:pctWidth>
+            </wp14:sizeRelH>
+            <wp14:sizeRelV relativeFrom="page">
+              <wp14:pctHeight>0</wp14:pctHeight>
+            </wp14:sizeRelV>
+          </wp:anchor>
+        </w:drawing>
+      </w:r>
+      <w:proofErr w:type="spellStart"/>
+      <w:r>
+        <w:rPr>
+          <w:b/>
+          <w:bCs/>
+        </w:rPr>
+        <w:t>Resoluciòn</w:t>
+      </w:r>
+      <w:proofErr w:type="spellEnd"/>
+      <w:r>
+        <w:rPr>
+          <w:b/>
+          <w:bCs/>
+        </w:rPr>
+        <w:t>:</w:t>
+      </w:r>
+      <w:r>
+        <w:rPr>
+          <w:b/>
+          <w:bCs/>
+        </w:rPr>
+        <w:t xml:space="preserve"> NUEVA QUERY</w:t>
+      </w:r>
+    </w:p>
+    <w:p>
+      <w:pPr>
+        <w:rPr>
+          <w:b/>
+          <w:bCs/>
+        </w:rPr>
+      </w:pPr>
+      <w:r>
+        <w:rPr>
+          <w:b/>
+          <w:bCs/>
+          <w:noProof/>
+          <w:lang w:val="en-US"/>
+        </w:rPr>
+        <w:drawing>
+          <wp:anchor distT="0" distB="0" distL="114300" distR="114300" simplePos="0" relativeHeight="251659264" behindDoc="1" locked="0" layoutInCell="1" allowOverlap="1" wp14:anchorId="1A5494EF" wp14:editId="44025A9C">
+            <wp:simplePos x="0" y="0"/>
+            <wp:positionH relativeFrom="margin">
+              <wp:align>left</wp:align>
+            </wp:positionH>
+            <wp:positionV relativeFrom="paragraph">
+              <wp:posOffset>10938</wp:posOffset>
+            </wp:positionV>
+            <wp:extent cx="4045273" cy="3251119"/>
+            <wp:effectExtent l="0" t="0" r="0" b="6985"/>
+            <wp:wrapNone/>
+            <wp:docPr id="1317887568" name="Picture 1"/>
+            <wp:cNvGraphicFramePr>
+              <a:graphicFrameLocks xmlns:a="http://schemas.openxmlformats.org/drawingml/2006/main" noChangeAspect="1"/>
+            </wp:cNvGraphicFramePr>
+            <a:graphic xmlns:a="http://schemas.openxmlformats.org/drawingml/2006/main">
+              <a:graphicData uri="http://schemas.openxmlformats.org/drawingml/2006/picture">
+                <pic:pic xmlns:pic="http://schemas.openxmlformats.org/drawingml/2006/picture">
+                  <pic:nvPicPr>
+                    <pic:cNvPr id="1317887568" name=""/>
+                    <pic:cNvPicPr/>
+                  </pic:nvPicPr>
+                  <pic:blipFill>
+                    <a:blip r:embed="rId12">
+                      <a:extLst>
+                        <a:ext uri="{28A0092B-C50C-407E-A947-70E740481C1C}">
+                          <a14:useLocalDpi xmlns:a14="http://schemas.microsoft.com/office/drawing/2010/main" val="0"/>
+                        </a:ext>
+                      </a:extLst>
+                    </a:blip>
+                    <a:stretch>
+                      <a:fillRect/>
+                    </a:stretch>
+                  </pic:blipFill>
+                  <pic:spPr>
+                    <a:xfrm>
+                      <a:off x="0" y="0"/>
+                      <a:ext cx="4045273" cy="3251119"/>
+                    </a:xfrm>
+                    <a:prstGeom prst="rect">
+                      <a:avLst/>
+                    </a:prstGeom>
+                  </pic:spPr>
+                </pic:pic>
+              </a:graphicData>
+            </a:graphic>
+            <wp14:sizeRelH relativeFrom="page">
+              <wp14:pctWidth>0</wp14:pctWidth>
+            </wp14:sizeRelH>
+            <wp14:sizeRelV relativeFrom="page">
+              <wp14:pctHeight>0</wp14:pctHeight>
+            </wp14:sizeRelV>
+          </wp:anchor>
+        </w:drawing>
+      </w:r>
+    </w:p>
+    <w:p>
+      <w:pPr>
+        <w:rPr>
+          <w:b/>
+          <w:bCs/>
+        </w:rPr>
+      </w:pPr>
+    </w:p>
+    <w:p>
+      <w:pPr>
+        <w:rPr>
+          <w:b/>
+          <w:bCs/>
+        </w:rPr>
+      </w:pPr>
+      <w:r>
+        <w:rPr>
+          <w:b/>
+          <w:bCs/>
+          <w:noProof/>
+          <w:lang w:val="en-US"/>
+        </w:rPr>
+        <w:drawing>
+          <wp:anchor distT="0" distB="0" distL="114300" distR="114300" simplePos="0" relativeHeight="251658240" behindDoc="0" locked="0" layoutInCell="1" allowOverlap="1" wp14:anchorId="00609565" wp14:editId="31EB36CB">
+            <wp:simplePos x="0" y="0"/>
+            <wp:positionH relativeFrom="margin">
+              <wp:posOffset>3371850</wp:posOffset>
+            </wp:positionH>
+            <wp:positionV relativeFrom="paragraph">
+              <wp:posOffset>1024586</wp:posOffset>
+            </wp:positionV>
+            <wp:extent cx="1419943" cy="1388676"/>
+            <wp:effectExtent l="0" t="0" r="8890" b="2540"/>
+            <wp:wrapNone/>
+            <wp:docPr id="1085606917" name="Picture 1"/>
+            <wp:cNvGraphicFramePr>
+              <a:graphicFrameLocks xmlns:a="http://schemas.openxmlformats.org/drawingml/2006/main" noChangeAspect="1"/>
+            </wp:cNvGraphicFramePr>
+            <a:graphic xmlns:a="http://schemas.openxmlformats.org/drawingml/2006/main">
+              <a:graphicData uri="http://schemas.openxmlformats.org/drawingml/2006/picture">
+                <pic:pic xmlns:pic="http://schemas.openxmlformats.org/drawingml/2006/picture">
+                  <pic:nvPicPr>
+                    <pic:cNvPr id="1085606917" name=""/>
+                    <pic:cNvPicPr/>
+                  </pic:nvPicPr>
+                  <pic:blipFill rotWithShape="1">
+                    <a:blip r:embed="rId13">
+                      <a:extLst>
+                        <a:ext uri="{28A0092B-C50C-407E-A947-70E740481C1C}">
+                          <a14:useLocalDpi xmlns:a14="http://schemas.microsoft.com/office/drawing/2010/main" val="0"/>
+                        </a:ext>
+                      </a:extLst>
+                    </a:blip>
+                    <a:srcRect b="11049"/>
+                    <a:stretch>
+                      <a:fillRect/>
+                    </a:stretch>
+                  </pic:blipFill>
+                  <pic:spPr bwMode="auto">
+                    <a:xfrm>
+                      <a:off x="0" y="0"/>
+                      <a:ext cx="1419943" cy="1388676"/>
+                    </a:xfrm>
+                    <a:prstGeom prst="rect">
+                      <a:avLst/>
+                    </a:prstGeom>
+                    <a:ln>
+                      <a:noFill/>
+                    </a:ln>
+                    <a:extLst>
+                      <a:ext uri="{53640926-AAD7-44D8-BBD7-CCE9431645EC}">
+                        <a14:shadowObscured xmlns:a14="http://schemas.microsoft.com/office/drawing/2010/main"/>
+                      </a:ext>
+                    </a:extLst>
+                  </pic:spPr>
+                </pic:pic>
+              </a:graphicData>
+            </a:graphic>
+            <wp14:sizeRelH relativeFrom="page">
+              <wp14:pctWidth>0</wp14:pctWidth>
+            </wp14:sizeRelH>
+            <wp14:sizeRelV relativeFrom="page">
+              <wp14:pctHeight>0</wp14:pctHeight>
+            </wp14:sizeRelV>
+          </wp:anchor>
+        </w:drawing>
+      </w:r>
+      <w:r>
+        <w:rPr>
+          <w:b/>
+          <w:bCs/>
+        </w:rPr>
+        <w:tab/>
+      </w:r>
+      <w:r>
+        <w:rPr>
+          <w:b/>
+          <w:bCs/>
+        </w:rPr>
+        <w:tab/>
+      </w:r>
+      <w:r>
+        <w:rPr>
+          <w:b/>
+          <w:bCs/>
+        </w:rPr>
+        <w:tab/>
+      </w:r>
+      <w:r>
+        <w:rPr>
+          <w:b/>
+          <w:bCs/>
+        </w:rPr>
+        <w:tab/>
+      </w:r>
+      <w:r>
+        <w:rPr>
+          <w:b/>
+          <w:bCs/>
+        </w:rPr>
+        <w:tab/>
+      </w:r>
+      <w:r>
+        <w:rPr>
+          <w:b/>
+          <w:bCs/>
+        </w:rPr>
+        <w:tab/>
+      </w:r>
+      <w:r>
+        <w:rPr>
+          <w:b/>
+          <w:bCs/>
+        </w:rPr>
+        <w:tab/>
+      </w:r>
+      <w:r>
+        <w:rPr>
+          <w:b/>
+          <w:bCs/>
+        </w:rPr>
+        <w:tab/>
+      </w:r>
+      <w:r>
+        <w:rPr>
+          <w:b/>
+          <w:bCs/>
+        </w:rPr>
+        <w:tab/>
+      </w:r>
+      <w:r>
+        <w:rPr>
+          <w:b/>
+          <w:bCs/>
+        </w:rPr>
+        <w:tab/>
+      </w:r>
+      <w:r>
+        <w:rPr>
+          <w:b/>
+          <w:bCs/>
+        </w:rPr>
+        <w:tab/>
+      </w:r>
+      <w:r>
+        <w:rPr>
+          <w:b/>
+          <w:bCs/>
+        </w:rPr>
+        <w:tab/>
+      </w:r>
+      <w:r>
+        <w:rPr>
+          <w:b/>
+          <w:bCs/>
+        </w:rPr>
+        <w:tab/>
+      </w:r>
+      <w:r>
+        <w:rPr>
+          <w:b/>
+          <w:bCs/>
+        </w:rPr>
+        <w:tab/>
+      </w:r>
+      <w:r>
+        <w:rPr>
+          <w:b/>
+          <w:bCs/>
+        </w:rPr>
+        <w:tab/>
+      </w:r>
+      <w:r>
+        <w:rPr>
+          <w:b/>
+          <w:bCs/>
+        </w:rPr>
+        <w:tab/>
+      </w:r>
+      <w:r>
+        <w:rPr>
+          <w:b/>
+          <w:bCs/>
+        </w:rPr>
+        <w:tab/>
+      </w:r>
+      <w:r>
+        <w:rPr>
+          <w:b/>
+          <w:bCs/>
+        </w:rPr>
+        <w:tab/>
+      </w:r>
+      <w:r>
+        <w:rPr>
+          <w:b/>
+          <w:bCs/>
+        </w:rPr>
+        <w:tab/>
+      </w:r>
+      <w:r>
+        <w:rPr>
+          <w:b/>
+          <w:bCs/>
+        </w:rPr>
+        <w:tab/>
+      </w:r>
+      <w:r>
+        <w:rPr>
+          <w:b/>
+          <w:bCs/>
+        </w:rPr>
+        <w:tab/>
+      </w:r>
+      <w:r>
+        <w:rPr>
+          <w:b/>
+          <w:bCs/>
+        </w:rPr>
+        <w:tab/>
+      </w:r>
+      <w:r>
+        <w:rPr>
+          <w:b/>
+          <w:bCs/>
+        </w:rPr>
+        <w:tab/>
+      </w:r>
+      <w:r>
+        <w:rPr>
+          <w:b/>
+          <w:bCs/>
+        </w:rPr>
+        <w:tab/>
+      </w:r>
+      <w:r>
+        <w:rPr>
+          <w:b/>
+          <w:bCs/>
+        </w:rPr>
+        <w:tab/>
+      </w:r>
+      <w:r>
+        <w:rPr>
+          <w:b/>
+          <w:bCs/>
+        </w:rPr>
+        <w:tab/>
+      </w:r>
+      <w:r>
+        <w:rPr>
+          <w:b/>
+          <w:bCs/>
+        </w:rPr>
+        <w:tab/>
+      </w:r>
+      <w:r>
+        <w:rPr>
+          <w:b/>
+          <w:bCs/>
+        </w:rPr>
+        <w:tab/>
+      </w:r>
+      <w:r>
+        <w:rPr>
+          <w:b/>
+          <w:bCs/>
+        </w:rPr>
+        <w:tab/>
+      </w:r>
+      <w:r>
+        <w:rPr>
+          <w:b/>
+          <w:bCs/>
+        </w:rPr>
+        <w:tab/>
+      </w:r>
+      <w:r>
+        <w:rPr>
+          <w:b/>
+          <w:bCs/>
+        </w:rPr>
+        <w:tab/>
+      </w:r>
+      <w:r>
+        <w:rPr>
+          <w:b/>
+          <w:bCs/>
+        </w:rPr>
+        <w:tab/>
+      </w:r>
+      <w:r>
+        <w:rPr>
+          <w:b/>
+          <w:bCs/>
+        </w:rPr>
+        <w:tab/>
+      </w:r>
+      <w:r>
+        <w:rPr>
+          <w:b/>
+          <w:bCs/>
+        </w:rPr>
+        <w:tab/>
+      </w:r>
+      <w:r>
+        <w:rPr>
+          <w:b/>
+          <w:bCs/>
+        </w:rPr>
+        <w:tab/>
+      </w:r>
+      <w:r>
+        <w:rPr>
+          <w:b/>
+          <w:bCs/>
+        </w:rPr>
+        <w:tab/>
+      </w:r>
+      <w:r>
+        <w:rPr>
+          <w:b/>
+          <w:bCs/>
+        </w:rPr>
+        <w:tab/>
+      </w:r>
+      <w:r>
+        <w:rPr>
+          <w:b/>
+          <w:bCs/>
+        </w:rPr>
+        <w:tab/>
+      </w:r>
+      <w:r>
+        <w:rPr>
+          <w:b/>
+          <w:bCs/>
+        </w:rPr>
+        <w:tab/>
+      </w:r>
+      <w:r>
+        <w:rPr>
+          <w:b/>
+          <w:bCs/>
+        </w:rPr>
+        <w:tab/>
+      </w:r>
+      <w:r>
+        <w:rPr>
+          <w:b/>
+          <w:bCs/>
+        </w:rPr>
+        <w:tab/>
+      </w:r>
+      <w:r>
+        <w:rPr>
+          <w:b/>
+          <w:bCs/>
+        </w:rPr>
+        <w:tab/>
+      </w:r>
+      <w:r>
+        <w:rPr>
+          <w:b/>
+          <w:bCs/>
+        </w:rPr>
+        <w:tab/>
+      </w:r>
+      <w:r>
+        <w:rPr>
+          <w:b/>
+          <w:bCs/>
+        </w:rPr>
+        <w:tab/>
+      </w:r>
+      <w:r>
+        <w:rPr>
+          <w:b/>
+          <w:bCs/>
+        </w:rPr>
+        <w:tab/>
+      </w:r>
+      <w:r>
+        <w:rPr>
+          <w:b/>
+          <w:bCs/>
+        </w:rPr>
+        <w:tab/>
+      </w:r>
+      <w:r>
+        <w:rPr>
+          <w:b/>
+          <w:bCs/>
+        </w:rPr>
+        <w:tab/>
+      </w:r>
+      <w:r>
+        <w:rPr>
+          <w:b/>
+          <w:bCs/>
+        </w:rPr>
+        <w:tab/>
+      </w:r>
+      <w:r>
+        <w:rPr>
+          <w:b/>
+          <w:bCs/>
+        </w:rPr>
+        <w:tab/>
+      </w:r>
+      <w:r>
+        <w:rPr>
+          <w:b/>
+          <w:bCs/>
+        </w:rPr>
+        <w:tab/>
+      </w:r>
+      <w:r>
+        <w:rPr>
+          <w:b/>
+          <w:bCs/>
+        </w:rPr>
+        <w:tab/>
+      </w:r>
+      <w:r>
+        <w:rPr>
+          <w:b/>
+          <w:bCs/>
+        </w:rPr>
+        <w:tab/>
+      </w:r>
+      <w:r>
+        <w:rPr>
+          <w:b/>
+          <w:bCs/>
+        </w:rPr>
+        <w:tab/>
+      </w:r>
+      <w:r>
+        <w:rPr>
+          <w:b/>
+          <w:bCs/>
+        </w:rPr>
+        <w:tab/>
+      </w:r>
+      <w:r>
+        <w:rPr>
+          <w:b/>
+          <w:bCs/>
+        </w:rPr>
+        <w:tab/>
+      </w:r>
+      <w:r>
+        <w:rPr>
+          <w:b/>
+          <w:bCs/>
+        </w:rPr>
+        <w:tab/>
+      </w:r>
+      <w:r>
+        <w:rPr>
+          <w:b/>
+          <w:bCs/>
+        </w:rPr>
+        <w:tab/>
+      </w:r>
+      <w:r>
+        <w:rPr>
+          <w:b/>
+          <w:bCs/>
+        </w:rPr>
+        <w:tab/>
+      </w:r>
+      <w:r>
+        <w:rPr>
+          <w:b/>
+          <w:bCs/>
+        </w:rPr>
+        <w:tab/>
+      </w:r>
+      <w:r>
+        <w:rPr>
+          <w:b/>
+          <w:bCs/>
+        </w:rPr>
+        <w:tab/>
+      </w:r>
+      <w:r>
+        <w:rPr>
+          <w:b/>
+          <w:bCs/>
+        </w:rPr>
+        <w:tab/>
+      </w:r>
+      <w:r>
+        <w:rPr>
+          <w:b/>
+          <w:bCs/>
+        </w:rPr>
+        <w:tab/>
+      </w:r>
+      <w:r>
+        <w:rPr>
+          <w:b/>
+          <w:bCs/>
+        </w:rPr>
+        <w:tab/>
+      </w:r>
+      <w:r>
+        <w:rPr>
+          <w:b/>
+          <w:bCs/>
+        </w:rPr>
+        <w:tab/>
+      </w:r>
+      <w:r>
+        <w:rPr>
+          <w:b/>
+          <w:bCs/>
+        </w:rPr>
+        <w:tab/>
+      </w:r>
+      <w:r>
+        <w:rPr>
+          <w:b/>
+          <w:bCs/>
+        </w:rPr>
+        <w:tab/>
+      </w:r>
+      <w:r>
+        <w:rPr>
+          <w:b/>
+          <w:bCs/>
+        </w:rPr>
+        <w:tab/>
+      </w:r>
+      <w:r>
+        <w:rPr>
+          <w:b/>
+          <w:bCs/>
+        </w:rPr>
+        <w:tab/>
+      </w:r>
+      <w:r>
+        <w:rPr>
+          <w:b/>
+          <w:bCs/>
+        </w:rPr>
+        <w:tab/>
+      </w:r>
+      <w:r>
+        <w:rPr>
+          <w:b/>
+          <w:bCs/>
+        </w:rPr>
+        <w:tab/>
+      </w:r>
+      <w:r>
+        <w:rPr>
+          <w:b/>
+          <w:bCs/>
+        </w:rPr>
+        <w:tab/>
+      </w:r>
+      <w:r>
+        <w:rPr>
+          <w:b/>
+          <w:bCs/>
+        </w:rPr>
+        <w:tab/>
+      </w:r>
+      <w:r>
+        <w:rPr>
+          <w:b/>
+          <w:bCs/>
+        </w:rPr>
+        <w:tab/>
+      </w:r>
+      <w:r>
+        <w:rPr>
+          <w:b/>
+          <w:bCs/>
+        </w:rPr>
+        <w:tab/>
+      </w:r>
+      <w:r>
+        <w:rPr>
+          <w:b/>
+          <w:bCs/>
+        </w:rPr>
+        <w:tab/>
+      </w:r>
+      <w:r>
+        <w:rPr>
+          <w:b/>
+          <w:bCs/>
+        </w:rPr>
+        <w:tab/>
+      </w:r>
+      <w:r>
+        <w:rPr>
+          <w:b/>
+          <w:bCs/>
+        </w:rPr>
+        <w:tab/>
+      </w:r>
+      <w:r>
+        <w:rPr>
+          <w:b/>
+          <w:bCs/>
+        </w:rPr>
+        <w:tab/>
+      </w:r>
+      <w:r>
+        <w:rPr>
+          <w:b/>
+          <w:bCs/>
+        </w:rPr>
+        <w:tab/>
+      </w:r>
+      <w:r>
+        <w:rPr>
+          <w:b/>
+          <w:bCs/>
+        </w:rPr>
+        <w:tab/>
+      </w:r>
+      <w:r>
+        <w:rPr>
+          <w:b/>
+          <w:bCs/>
+        </w:rPr>
+        <w:tab/>
+      </w:r>
+      <w:r>
+        <w:rPr>
+          <w:b/>
+          <w:bCs/>
+        </w:rPr>
+        <w:tab/>
+      </w:r>
+      <w:r>
+        <w:rPr>
+          <w:b/>
+          <w:bCs/>
+        </w:rPr>
+        <w:tab/>
+      </w:r>
+      <w:r>
+        <w:rPr>
+          <w:b/>
+          <w:bCs/>
+        </w:rPr>
+        <w:tab/>
+      </w:r>
+      <w:r>
+        <w:rPr>
+          <w:b/>
+          <w:bCs/>
+        </w:rPr>
+        <w:tab/>
+      </w:r>
+      <w:r>
+        <w:rPr>
+          <w:b/>
+          <w:bCs/>
+        </w:rPr>
+        <w:tab/>
+      </w:r>
+      <w:r>
+        <w:rPr>
+          <w:b/>
+          <w:bCs/>
+        </w:rPr>
+        <w:tab/>
+      </w:r>
+      <w:r>
+        <w:rPr>
+          <w:b/>
+          <w:bCs/>
+        </w:rPr>
+        <w:tab/>
+      </w:r>
+      <w:r>
+        <w:rPr>
+          <w:b/>
+          <w:bCs/>
+        </w:rPr>
+        <w:tab/>
+      </w:r>
+      <w:r>
+        <w:rPr>
+          <w:b/>
+          <w:bCs/>
+        </w:rPr>
+        <w:tab/>
+      </w:r>
+      <w:r>
+        <w:rPr>
+          <w:b/>
+          <w:bCs/>
+        </w:rPr>
+        <w:tab/>
+      </w:r>
+      <w:r>
+        <w:rPr>
+          <w:b/>
+          <w:bCs/>
+        </w:rPr>
+        <w:tab/>
+      </w:r>
+      <w:r>
+        <w:rPr>
+          <w:b/>
+          <w:bCs/>
+        </w:rPr>
+        <w:tab/>
+      </w:r>
+      <w:r>
+        <w:rPr>
+          <w:b/>
+          <w:bCs/>
+        </w:rPr>
+        <w:tab/>
+      </w:r>
+      <w:r>
+        <w:rPr>
+          <w:b/>
+          <w:bCs/>
+        </w:rPr>
+        <w:tab/>
+      </w:r>
+      <w:r>
+        <w:rPr>
+          <w:b/>
+          <w:bCs/>
+        </w:rPr>
+        <w:tab/>
+      </w:r>
+      <w:r>
+        <w:rPr>
+          <w:b/>
+          <w:bCs/>
+        </w:rPr>
+        <w:tab/>
+      </w:r>
+      <w:r>
+        <w:rPr>
+          <w:b/>
+          <w:bCs/>
+        </w:rPr>
+        <w:tab/>
+      </w:r>
+      <w:r>
+        <w:rPr>
+          <w:b/>
+          <w:bCs/>
+        </w:rPr>
+        <w:tab/>
+      </w:r>
+      <w:r>
+        <w:rPr>
+          <w:b/>
+          <w:bCs/>
+        </w:rPr>
+        <w:tab/>
+      </w:r>
+      <w:r>
+        <w:rPr>
+          <w:b/>
+          <w:bCs/>
+        </w:rPr>
+        <w:tab/>
+      </w:r>
+      <w:r>
+        <w:rPr>
+          <w:b/>
+          <w:bCs/>
+        </w:rPr>
+        <w:tab/>
+      </w:r>
+      <w:r>
+        <w:rPr>
+          <w:b/>
+          <w:bCs/>
+        </w:rPr>
+        <w:tab/>
+      </w:r>
+      <w:r>
+        <w:rPr>
+          <w:b/>
+          <w:bCs/>
+        </w:rPr>
+        <w:tab/>
+      </w:r>
+      <w:r>
+        <w:rPr>
+          <w:b/>
+          <w:bCs/>
+        </w:rPr>
+        <w:tab/>
+      </w:r>
+      <w:r>
+        <w:rPr>
+          <w:b/>
+          <w:bCs/>
+        </w:rPr>
+        <w:tab/>
+      </w:r>
+      <w:r>
+        <w:rPr>
+          <w:b/>
+          <w:bCs/>
+        </w:rPr>
+        <w:tab/>
+      </w:r>
+      <w:r>
+        <w:rPr>
+          <w:b/>
+          <w:bCs/>
+        </w:rPr>
+        <w:tab/>
+      </w:r>
+      <w:r>
+        <w:rPr>
+          <w:b/>
+          <w:bCs/>
+        </w:rPr>
+        <w:tab/>
+      </w:r>
+      <w:r>
+        <w:rPr>
+          <w:b/>
+          <w:bCs/>
+        </w:rPr>
+        <w:tab/>
+      </w:r>
+      <w:r>
+        <w:rPr>
+          <w:b/>
+          <w:bCs/>
+        </w:rPr>
+        <w:tab/>
+      </w:r>
+      <w:r>
+        <w:rPr>
+          <w:b/>
+          <w:bCs/>
+        </w:rPr>
+        <w:tab/>
+      </w:r>
+      <w:r>
+        <w:rPr>
+          <w:b/>
+          <w:bCs/>
+        </w:rPr>
+        <w:tab/>
+      </w:r>
+      <w:r>
+        <w:rPr>
+          <w:b/>
+          <w:bCs/>
+        </w:rPr>
+        <w:tab/>
+      </w:r>
+      <w:r>
+        <w:rPr>
+          <w:b/>
+          <w:bCs/>
+        </w:rPr>
+        <w:tab/>
+      </w:r>
+      <w:r>
+        <w:rPr>
+          <w:b/>
+          <w:bCs/>
+        </w:rPr>
+        <w:tab/>
+      </w:r>
+      <w:r>
+        <w:rPr>
+          <w:b/>
+          <w:bCs/>
+        </w:rPr>
+        <w:tab/>
+      </w:r>
+      <w:r>
+        <w:rPr>
+          <w:b/>
+          <w:bCs/>
+        </w:rPr>
+        <w:tab/>
+      </w:r>
+      <w:r>
+        <w:rPr>
+          <w:b/>
+          <w:bCs/>
+        </w:rPr>
+        <w:tab/>
+      </w:r>
+      <w:r>
+        <w:rPr>
+          <w:b/>
+          <w:bCs/>
+        </w:rPr>
+        <w:tab/>
+      </w:r>
+      <w:r>
+        <w:rPr>
+          <w:b/>
+          <w:bCs/>
+        </w:rPr>
+        <w:tab/>
+      </w:r>
+      <w:r>
+        <w:rPr>
+          <w:b/>
+          <w:bCs/>
+        </w:rPr>
+        <w:tab/>
+      </w:r>
+      <w:r>
+        <w:rPr>
+          <w:b/>
+          <w:bCs/>
+        </w:rPr>
+        <w:tab/>
+      </w:r>
+      <w:r>
+        <w:rPr>
+          <w:b/>
+          <w:bCs/>
+        </w:rPr>
+        <w:tab/>
+      </w:r>
+      <w:r>
+        <w:rPr>
+          <w:b/>
+          <w:bCs/>
+        </w:rPr>
+        <w:tab/>
+      </w:r>
+      <w:r>
+        <w:rPr>
+          <w:b/>
+          <w:bCs/>
+        </w:rPr>
+        <w:tab/>
+      </w:r>
+      <w:r>
+        <w:rPr>
+          <w:b/>
+          <w:bCs/>
+        </w:rPr>
+        <w:tab/>
+      </w:r>
+      <w:r>
+        <w:rPr>
+          <w:b/>
+          <w:bCs/>
+        </w:rPr>
+        <w:tab/>
+      </w:r>
+      <w:r>
+        <w:rPr>
+          <w:b/>
+          <w:bCs/>
+        </w:rPr>
+        <w:tab/>
+      </w:r>
+      <w:r>
+        <w:rPr>
+          <w:b/>
+          <w:bCs/>
+        </w:rPr>
+        <w:tab/>
+      </w:r>
+      <w:r>
+        <w:rPr>
+          <w:b/>
+          <w:bCs/>
+        </w:rPr>
+        <w:tab/>
+      </w:r>
+      <w:r>
+        <w:rPr>
+          <w:b/>
+          <w:bCs/>
+        </w:rPr>
+        <w:tab/>
+      </w:r>
+      <w:r>
+        <w:rPr>
+          <w:b/>
+          <w:bCs/>
+        </w:rPr>
+        <w:tab/>
+      </w:r>
+      <w:r>
+        <w:rPr>
+          <w:b/>
+          <w:bCs/>
+        </w:rPr>
+        <w:tab/>
+      </w:r>
+      <w:r>
+        <w:rPr>
+          <w:b/>
+          <w:bCs/>
+        </w:rPr>
+        <w:tab/>
+      </w:r>
+      <w:r>
+        <w:rPr>
+          <w:b/>
+          <w:bCs/>
+        </w:rPr>
+        <w:tab/>
+      </w:r>
+      <w:r>
+        <w:rPr>
+          <w:b/>
+          <w:bCs/>
+        </w:rPr>
+        <w:tab/>
+      </w:r>
+      <w:r>
+        <w:rPr>
+          <w:b/>
+          <w:bCs/>
+        </w:rPr>
+        <w:tab/>
+      </w:r>
+      <w:r>
+        <w:rPr>
+          <w:b/>
+          <w:bCs/>
+        </w:rPr>
+        <w:tab/>
+      </w:r>
+      <w:r>
+        <w:rPr>
+          <w:b/>
+          <w:bCs/>
+        </w:rPr>
+        <w:tab/>
+      </w:r>
+      <w:r>
+        <w:rPr>
+          <w:b/>
+          <w:bCs/>
+        </w:rPr>
+        <w:tab/>
+      </w:r>
+      <w:r>
+        <w:rPr>
+          <w:b/>
+          <w:bCs/>
+        </w:rPr>
+        <w:tab/>
+      </w:r>
+      <w:r>
+        <w:rPr>
+          <w:b/>
+          <w:bCs/>
+        </w:rPr>
+        <w:tab/>
+      </w:r>
+      <w:r>
+        <w:rPr>
+          <w:b/>
+          <w:bCs/>
+        </w:rPr>
+        <w:tab/>
+      </w:r>
+      <w:r>
+        <w:rPr>
+          <w:b/>
+          <w:bCs/>
+        </w:rPr>
+        <w:tab/>
+      </w:r>
+      <w:r>
+        <w:rPr>
+          <w:b/>
+          <w:bCs/>
+        </w:rPr>
+        <w:tab/>
+      </w:r>
+      <w:r>
+        <w:rPr>
+          <w:b/>
+          <w:bCs/>
+        </w:rPr>
+        <w:tab/>
+      </w:r>
+      <w:r>
+        <w:rPr>
+          <w:b/>
+          <w:bCs/>
+        </w:rPr>
+        <w:tab/>
+      </w:r>
+      <w:r>
+        <w:rPr>
+          <w:b/>
+          <w:bCs/>
+        </w:rPr>
+        <w:tab/>
+      </w:r>
+      <w:r>
+        <w:rPr>
+          <w:b/>
+          <w:bCs/>
+        </w:rPr>
+        <w:tab/>
+      </w:r>
+      <w:r>
+        <w:rPr>
+          <w:b/>
+          <w:bCs/>
+        </w:rPr>
+        <w:tab/>
+      </w:r>
+      <w:r>
+        <w:rPr>
+          <w:b/>
+          <w:bCs/>
+        </w:rPr>
+        <w:tab/>
+      </w:r>
+      <w:r>
+        <w:rPr>
+          <w:b/>
+          <w:bCs/>
+        </w:rPr>
+        <w:tab/>
+      </w:r>
+      <w:r>
+        <w:rPr>
+          <w:b/>
+          <w:bCs/>
+        </w:rPr>
+        <w:tab/>
+      </w:r>
+      <w:r>
+        <w:rPr>
+          <w:b/>
+          <w:bCs/>
+        </w:rPr>
+        <w:tab/>
+      </w:r>
+    </w:p>
+    <w:p>
+      <w:pPr>
+        <w:rPr>
+          <w:b/>
+          <w:bCs/>
+        </w:rPr>
+      </w:pPr>
+      <w:r>
+        <w:rPr>
+          <w:b/>
+          <w:bCs/>
+        </w:rPr>
+        <w:t xml:space="preserve">Nueva </w:t>
+      </w:r>
+      <w:proofErr w:type="spellStart"/>
+      <w:r>
+        <w:rPr>
+          <w:b/>
+          <w:bCs/>
+        </w:rPr>
+        <w:t>ejecucion</w:t>
+      </w:r>
+      <w:proofErr w:type="spellEnd"/>
+      <w:r>
+        <w:rPr>
+          <w:b/>
+          <w:bCs/>
+        </w:rPr>
+        <w:t>:</w:t>
+      </w:r>
+      <w:r>
+        <w:rPr>
+          <w:rFonts w:ascii="Calibri" w:eastAsia="Times New Roman" w:hAnsi="Calibri" w:cs="Calibri"/>
+          <w:color w:val="000000"/>
+          <w:kern w:val="0"/>
+          <w:sz w:val="22"/>
+          <w:szCs w:val="22"/>
+          <w:lang w:eastAsia="es-AR"/>
+          <w14:ligatures w14:val="none"/>
+        </w:rPr>
+        <w:t xml:space="preserve"> </w:t>
+      </w:r>
+      <w:r>
+        <w:rPr>
+          <w:rFonts w:ascii="Calibri" w:eastAsia="Times New Roman" w:hAnsi="Calibri" w:cs="Calibri"/>
+          <w:color w:val="000000"/>
+          <w:kern w:val="0"/>
+          <w:sz w:val="22"/>
+          <w:szCs w:val="22"/>
+          <w:lang w:eastAsia="es-AR"/>
+          <w14:ligatures w14:val="none"/>
+        </w:rPr>
+        <w:tab/>
+      </w:r>
+      <w:r>
+        <w:rPr>
+          <w:rFonts w:ascii="Calibri" w:eastAsia="Times New Roman" w:hAnsi="Calibri" w:cs="Calibri"/>
+          <w:color w:val="000000"/>
+          <w:kern w:val="0"/>
+          <w:sz w:val="22"/>
+          <w:szCs w:val="22"/>
+          <w:lang w:eastAsia="es-AR"/>
+          <w14:ligatures w14:val="none"/>
+        </w:rPr>
+        <w:tab/>
+      </w:r>
+      <w:r>
+        <w:rPr>
+          <w:rFonts w:ascii="Calibri" w:eastAsia="Times New Roman" w:hAnsi="Calibri" w:cs="Calibri"/>
+          <w:color w:val="000000"/>
+          <w:kern w:val="0"/>
+          <w:sz w:val="22"/>
+          <w:szCs w:val="22"/>
+          <w:lang w:eastAsia="es-AR"/>
+          <w14:ligatures w14:val="none"/>
+        </w:rPr>
+        <w:t>KC03C52.CURSOS.FUENTE(</w:t>
+      </w:r>
+      <w:r>
+        <w:rPr>
+          <w:rFonts w:ascii="Calibri" w:eastAsia="Times New Roman" w:hAnsi="Calibri" w:cs="Calibri"/>
+          <w:b/>
+          <w:bCs/>
+          <w:color w:val="000000"/>
+          <w:kern w:val="0"/>
+          <w:sz w:val="22"/>
+          <w:szCs w:val="22"/>
+          <w:lang w:eastAsia="es-AR"/>
+          <w14:ligatures w14:val="none"/>
+        </w:rPr>
+        <w:t>JCLB2C52</w:t>
+      </w:r>
+      <w:r>
+        <w:rPr>
+          <w:rFonts w:ascii="Calibri" w:eastAsia="Times New Roman" w:hAnsi="Calibri" w:cs="Calibri"/>
+          <w:color w:val="000000"/>
+          <w:kern w:val="0"/>
+          <w:sz w:val="22"/>
+          <w:szCs w:val="22"/>
+          <w:lang w:eastAsia="es-AR"/>
+          <w14:ligatures w14:val="none"/>
+        </w:rPr>
+        <w:t>)</w:t>
+      </w:r>
+      <w:r>
+        <w:rPr>
+          <w:b/>
+          <w:bCs/>
+        </w:rPr>
+        <w:t xml:space="preserve"> </w:t>
+      </w:r>
+      <w:r>
+        <w:rPr>
+          <w:b/>
+          <w:bCs/>
+          <w:lang w:val="en-US"/>
+        </w:rPr>
+        <w:drawing>
+          <wp:inline distT="0" distB="0" distL="0" distR="0" wp14:anchorId="30136619" wp14:editId="34415589">
+            <wp:extent cx="4866198" cy="1460508"/>
+            <wp:effectExtent l="0" t="0" r="0" b="6350"/>
+            <wp:docPr id="1595030950" name="Picture 1"/>
+            <wp:cNvGraphicFramePr>
+              <a:graphicFrameLocks xmlns:a="http://schemas.openxmlformats.org/drawingml/2006/main" noChangeAspect="1"/>
+            </wp:cNvGraphicFramePr>
+            <a:graphic xmlns:a="http://schemas.openxmlformats.org/drawingml/2006/main">
+              <a:graphicData uri="http://schemas.openxmlformats.org/drawingml/2006/picture">
+                <pic:pic xmlns:pic="http://schemas.openxmlformats.org/drawingml/2006/picture">
+                  <pic:nvPicPr>
+                    <pic:cNvPr id="1595030950" name=""/>
+                    <pic:cNvPicPr/>
+                  </pic:nvPicPr>
+                  <pic:blipFill>
+                    <a:blip r:embed="rId14"/>
+                    <a:stretch>
+                      <a:fillRect/>
+                    </a:stretch>
+                  </pic:blipFill>
+                  <pic:spPr>
+                    <a:xfrm>
+                      <a:off x="0" y="0"/>
+                      <a:ext cx="4902843" cy="1471507"/>
+                    </a:xfrm>
+                    <a:prstGeom prst="rect">
+                      <a:avLst/>
+                    </a:prstGeom>
+                  </pic:spPr>
+                </pic:pic>
+              </a:graphicData>
+            </a:graphic>
+          </wp:inline>
+        </w:drawing>
+      </w:r>
+    </w:p>
+    <w:p>
+      <w:pPr>
+        <w:rPr>
+          <w:b/>
+          <w:bCs/>
+          <w:lang w:val="en-US"/>
+        </w:rPr>
+      </w:pPr>
+      <w:r>
+        <w:rPr>
+          <w:b/>
+          <w:bCs/>
+          <w:lang w:val="en-US"/>
+        </w:rPr>
+        <w:drawing>
+          <wp:anchor distT="0" distB="0" distL="114300" distR="114300" simplePos="0" relativeHeight="251660288" behindDoc="0" locked="0" layoutInCell="1" allowOverlap="1" wp14:anchorId="28841BA8" wp14:editId="5F669A39">
+            <wp:simplePos x="0" y="0"/>
+            <wp:positionH relativeFrom="margin">
+              <wp:posOffset>0</wp:posOffset>
+            </wp:positionH>
+            <wp:positionV relativeFrom="paragraph">
+              <wp:posOffset>289256</wp:posOffset>
+            </wp:positionV>
+            <wp:extent cx="5358765" cy="3324225"/>
+            <wp:effectExtent l="0" t="0" r="0" b="9525"/>
+            <wp:wrapNone/>
+            <wp:docPr id="731761005" name="Picture 1"/>
+            <wp:cNvGraphicFramePr>
+              <a:graphicFrameLocks xmlns:a="http://schemas.openxmlformats.org/drawingml/2006/main" noChangeAspect="1"/>
+            </wp:cNvGraphicFramePr>
+            <a:graphic xmlns:a="http://schemas.openxmlformats.org/drawingml/2006/main">
+              <a:graphicData uri="http://schemas.openxmlformats.org/drawingml/2006/picture">
+                <pic:pic xmlns:pic="http://schemas.openxmlformats.org/drawingml/2006/picture">
+                  <pic:nvPicPr>
+                    <pic:cNvPr id="731761005" name=""/>
+                    <pic:cNvPicPr/>
+                  </pic:nvPicPr>
+                  <pic:blipFill>
+                    <a:blip r:embed="rId15">
+                      <a:extLst>
+                        <a:ext uri="{28A0092B-C50C-407E-A947-70E740481C1C}">
+                          <a14:useLocalDpi xmlns:a14="http://schemas.microsoft.com/office/drawing/2010/main" val="0"/>
+                        </a:ext>
+                      </a:extLst>
+                    </a:blip>
+                    <a:stretch>
+                      <a:fillRect/>
+                    </a:stretch>
+                  </pic:blipFill>
+                  <pic:spPr>
+                    <a:xfrm>
+                      <a:off x="0" y="0"/>
+                      <a:ext cx="5358765" cy="3324225"/>
+                    </a:xfrm>
+                    <a:prstGeom prst="rect">
+                      <a:avLst/>
+                    </a:prstGeom>
+                  </pic:spPr>
+                </pic:pic>
+              </a:graphicData>
+            </a:graphic>
+            <wp14:sizeRelH relativeFrom="page">
+              <wp14:pctWidth>0</wp14:pctWidth>
+            </wp14:sizeRelH>
+            <wp14:sizeRelV relativeFrom="page">
+              <wp14:pctHeight>0</wp14:pctHeight>
+            </wp14:sizeRelV>
+          </wp:anchor>
+        </w:drawing>
+      </w:r>
+      <w:r>
+        <w:rPr>
+          <w:b/>
+          <w:bCs/>
+          <w:lang w:val="en-US"/>
+        </w:rPr>
+        <w:t>SDSF OUTPUT DISPLAY KC03C52J JOB05236</w:t>
+      </w:r>
+    </w:p>
+    <w:p>
+      <w:pPr>
+        <w:rPr>
+          <w:b/>
+          <w:bCs/>
+          <w:lang w:val="en-US"/>
+        </w:rPr>
+      </w:pPr>
+      <w:r>
+        <w:rPr>
+          <w:b/>
+          <w:bCs/>
+          <w:lang w:val="en-US"/>
+        </w:rPr>
+        <w:tab/>
       </w:r>
     </w:p>
     <w:sectPr>

</xml_diff>